<commit_message>
Add Figures 1 and 2 for IJRM manuscript and update captions
Co-Authored-By: Claude Sonnet 5.5 <noreply@anthropic.com>
Claude-Session: https://claude.ai/code/session_01HnawjNDnkzMuwTK6W6stpZ
</commit_message>
<xml_diff>
--- a/influencer_submission/ijrm/manuscript_ijrm.docx
+++ b/influencer_submission/ijrm/manuscript_ijrm.docx
@@ -5084,35 +5084,28 @@
           <w:iCs/>
           <w:i/>
         </w:rPr>
-        <w:t xml:space="preserve">[Figure 1 here. Mean Cumulative Adopters After Injection. Notes. (a) Base configuration, 15 paired replications shown for comparability with panel (b). (b) Engagement elasticity</w:t>
-      </w:r>
+        <w:t xml:space="preserve">[Insert Figure 1 here. Figure 1. Mean cumulative adopters after injection in the base configuration (</w:t>
+      </w:r>
+      <m:oMath>
+        <m:r>
+          <m:t>β</m:t>
+        </m:r>
+        <m:r>
+          <m:rPr>
+            <m:sty m:val="p"/>
+          </m:rPr>
+          <m:t>=</m:t>
+        </m:r>
+        <m:r>
+          <m:t>0</m:t>
+        </m:r>
+      </m:oMath>
       <w:r>
         <w:rPr>
           <w:iCs/>
           <w:i/>
         </w:rPr>
-        <w:t xml:space="preserve"> </w:t>
-      </w:r>
-      <m:oMath>
-        <m:r>
-          <m:t>β</m:t>
-        </m:r>
-        <m:r>
-          <m:rPr>
-            <m:sty m:val="p"/>
-          </m:rPr>
-          <m:t>=</m:t>
-        </m:r>
-        <m:r>
-          <m:t>0.3</m:t>
-        </m:r>
-      </m:oMath>
-      <w:r>
-        <w:rPr>
-          <w:iCs/>
-          <w:i/>
-        </w:rPr>
-        <w:t xml:space="preserve">.]</w:t>
+        <w:t xml:space="preserve">, equal-link budget, 30 paired replications; values from Table 2).]</w:t>
       </w:r>
     </w:p>
     <w:bookmarkEnd w:id="36"/>
@@ -7885,7 +7878,7 @@
         </m:r>
       </m:oMath>
       <w:r>
-        <w:t xml:space="preserve">, distributed seeding produced more adopters (175 vs. 123), led at every hour (Figure 1(b)), and had better worst-case outcomes (</w:t>
+        <w:t xml:space="preserve">, distributed seeding produced more adopters (175 vs. 123), led at every hour, and had better worst-case outcomes (</w:t>
       </w:r>
       <m:oMath>
         <m:r>
@@ -8898,7 +8891,7 @@
           <w:iCs/>
           <w:i/>
         </w:rPr>
-        <w:t xml:space="preserve">[Figure 2 here. Paired Difference (Concentrated Minus Distributed) in Final Adopters and in Discounted Reach at</w:t>
+        <w:t xml:space="preserve">[Insert Figure 2 here. Figure 2. Paired Difference (Concentrated Minus Distributed) in Final Adopters and in Discounted Reach at</w:t>
       </w:r>
       <w:r>
         <w:rPr>

</xml_diff>